<commit_message>
Keep the free Let's Encrypt SSL certificate on staging
- Enable-ZedHttps.ps1 -Status: shows the certificate's expiry date and the
  win-acme renewal task, and recreates the task if it is missing (Let's
  Encrypt no longer sends expiry e-mails). Runs after issuing, too.
- Deploy-ZedSite.ps1 -HttpsEmail: gets the free certificate and turns on
  HTTPS as part of the first deployment; a failed certificate step leaves
  the new release running on http with a clear warning.
- web.config: /.well-known/acme-challenge/ stays on http so automatic
  renewals are validated without going through the https redirect.
- Guide: free certificate facts (cost, 90-day validity, automatic renewal,
  port 80 requirement), monthly status check, troubleshooting.

Co-Authored-By: Claude Opus 5.5 <noreply@anthropic.com>
</commit_message>
<xml_diff>
--- a/deploy/windows/ZED-Staging-Deployment-Guide.docx
+++ b/deploy/windows/ZED-Staging-Deployment-Guide.docx
@@ -1408,7 +1408,7 @@
               <w:rPr>
                 <w:sz w:val="19"/>
               </w:rPr>
-              <w:t>An e-mail address for certificate expiry notices (Let's Encrypt).</w:t>
+              <w:t>An e-mail address for the free Let's Encrypt SSL certificate account.</w:t>
             </w:r>
           </w:p>
         </w:tc>
@@ -3131,7 +3131,24 @@
         <w:pStyle w:val="Heading3"/>
       </w:pPr>
       <w:r>
-        <w:t>B6. Switch on HTTPS (once)</w:t>
+        <w:t>B6. Free SSL certificate and HTTPS (once)</w:t>
+      </w:r>
+    </w:p>
+    <w:p>
+      <w:pPr>
+        <w:spacing w:after="80"/>
+      </w:pPr>
+      <w:r>
+        <w:t xml:space="preserve">The site uses a </w:t>
+      </w:r>
+      <w:r>
+        <w:rPr>
+          <w:b/>
+        </w:rPr>
+        <w:t>free SSL certificate from Let's Encrypt</w:t>
+      </w:r>
+      <w:r>
+        <w:t xml:space="preserve"> (no cost, no account to buy, trusted by all browsers). One command gets it and switches the site to HTTPS:</w:t>
       </w:r>
     </w:p>
     <w:p>
@@ -3153,7 +3170,7 @@
         <w:spacing w:after="80"/>
       </w:pPr>
       <w:r>
-        <w:t xml:space="preserve">It downloads win-acme, gets a free Let's Encrypt certificate for zedcms.umon.in, adds the https binding in IIS and then switches the website to HTTPS: </w:t>
+        <w:t xml:space="preserve">It downloads win-acme (the Let's Encrypt client for Windows), gets the certificate for zedcms.umon.in, adds the https binding in IIS and then switches the website to HTTPS: </w:t>
       </w:r>
       <w:r>
         <w:rPr>
@@ -3163,8 +3180,348 @@
         <w:t>APP_URL=https://zedcms.umon.in</w:t>
       </w:r>
       <w:r>
-        <w:t>, secure cookies, and every http address redirects to https. win-acme renews the certificate automatically (Task Scheduler).</w:t>
+        <w:t>, secure cookies, and every http address redirects to https. It ends by showing the certificate's expiry date and the automatic renewal task.</w:t>
       </w:r>
+    </w:p>
+    <w:p>
+      <w:pPr>
+        <w:spacing w:after="80"/>
+      </w:pPr>
+      <w:r>
+        <w:t xml:space="preserve">Tip: on the first deployment you can do B4 and B6 in one go by adding </w:t>
+      </w:r>
+      <w:r>
+        <w:rPr>
+          <w:rFonts w:ascii="Consolas" w:hAnsi="Consolas" w:eastAsia="Consolas"/>
+          <w:sz w:val="19"/>
+        </w:rPr>
+        <w:t>-HttpsEmail your.name@example.com</w:t>
+      </w:r>
+      <w:r>
+        <w:t xml:space="preserve"> to the </w:t>
+      </w:r>
+      <w:r>
+        <w:rPr>
+          <w:rFonts w:ascii="Consolas" w:hAnsi="Consolas" w:eastAsia="Consolas"/>
+          <w:sz w:val="19"/>
+        </w:rPr>
+        <w:t>Deploy-ZedSite.ps1</w:t>
+      </w:r>
+      <w:r>
+        <w:t xml:space="preserve"> command.</w:t>
+      </w:r>
+    </w:p>
+    <w:tbl>
+      <w:tblPr>
+        <w:tblStyle w:val="TableGrid"/>
+        <w:tblW w:type="auto" w:w="0"/>
+        <w:jc w:val="center"/>
+        <w:tblLook w:firstColumn="1" w:firstRow="1" w:lastColumn="0" w:lastRow="0" w:noHBand="0" w:noVBand="1" w:val="04A0"/>
+      </w:tblPr>
+      <w:tblGrid>
+        <w:gridCol w:w="4819"/>
+        <w:gridCol w:w="4819"/>
+      </w:tblGrid>
+      <w:tr>
+        <w:tc>
+          <w:tcPr>
+            <w:tcW w:type="dxa" w:w="1984"/>
+            <w:shd w:val="clear" w:color="auto" w:fill="2E7D4F"/>
+          </w:tcPr>
+          <w:p>
+            <w:pPr>
+              <w:spacing w:after="20"/>
+            </w:pPr>
+            <w:r>
+              <w:rPr>
+                <w:sz w:val="19"/>
+              </w:rPr>
+            </w:r>
+            <w:r>
+              <w:rPr>
+                <w:b/>
+                <w:color w:val="FFFFFF"/>
+                <w:sz w:val="19"/>
+              </w:rPr>
+              <w:t>Free certificate facts</w:t>
+            </w:r>
+          </w:p>
+        </w:tc>
+        <w:tc>
+          <w:tcPr>
+            <w:tcW w:type="dxa" w:w="7654"/>
+            <w:shd w:val="clear" w:color="auto" w:fill="2E7D4F"/>
+          </w:tcPr>
+          <w:p>
+            <w:pPr>
+              <w:spacing w:after="20"/>
+            </w:pPr>
+            <w:r>
+              <w:rPr>
+                <w:sz w:val="19"/>
+              </w:rPr>
+            </w:r>
+            <w:r>
+              <w:rPr>
+                <w:b/>
+                <w:color w:val="FFFFFF"/>
+                <w:sz w:val="19"/>
+              </w:rPr>
+            </w:r>
+          </w:p>
+        </w:tc>
+      </w:tr>
+      <w:tr>
+        <w:tc>
+          <w:tcPr>
+            <w:tcW w:type="dxa" w:w="1984"/>
+          </w:tcPr>
+          <w:p>
+            <w:pPr>
+              <w:spacing w:after="20"/>
+            </w:pPr>
+            <w:r>
+              <w:rPr>
+                <w:sz w:val="19"/>
+              </w:rPr>
+            </w:r>
+            <w:r>
+              <w:rPr>
+                <w:sz w:val="19"/>
+              </w:rPr>
+              <w:t>Cost</w:t>
+            </w:r>
+          </w:p>
+        </w:tc>
+        <w:tc>
+          <w:tcPr>
+            <w:tcW w:type="dxa" w:w="7654"/>
+          </w:tcPr>
+          <w:p>
+            <w:pPr>
+              <w:spacing w:after="20"/>
+            </w:pPr>
+            <w:r>
+              <w:rPr>
+                <w:sz w:val="19"/>
+              </w:rPr>
+            </w:r>
+            <w:r>
+              <w:rPr>
+                <w:sz w:val="19"/>
+              </w:rPr>
+              <w:t>Free (Let's Encrypt, a non-profit certificate authority).</w:t>
+            </w:r>
+          </w:p>
+        </w:tc>
+      </w:tr>
+      <w:tr>
+        <w:tc>
+          <w:tcPr>
+            <w:tcW w:type="dxa" w:w="1984"/>
+          </w:tcPr>
+          <w:p>
+            <w:pPr>
+              <w:spacing w:after="20"/>
+            </w:pPr>
+            <w:r>
+              <w:rPr>
+                <w:sz w:val="19"/>
+              </w:rPr>
+            </w:r>
+            <w:r>
+              <w:rPr>
+                <w:sz w:val="19"/>
+              </w:rPr>
+              <w:t>Valid for</w:t>
+            </w:r>
+          </w:p>
+        </w:tc>
+        <w:tc>
+          <w:tcPr>
+            <w:tcW w:type="dxa" w:w="7654"/>
+          </w:tcPr>
+          <w:p>
+            <w:pPr>
+              <w:spacing w:after="20"/>
+            </w:pPr>
+            <w:r>
+              <w:rPr>
+                <w:sz w:val="19"/>
+              </w:rPr>
+            </w:r>
+            <w:r>
+              <w:rPr>
+                <w:sz w:val="19"/>
+              </w:rPr>
+              <w:t>90 days (Let's Encrypt is gradually making this shorter).</w:t>
+            </w:r>
+          </w:p>
+        </w:tc>
+      </w:tr>
+      <w:tr>
+        <w:tc>
+          <w:tcPr>
+            <w:tcW w:type="dxa" w:w="1984"/>
+          </w:tcPr>
+          <w:p>
+            <w:pPr>
+              <w:spacing w:after="20"/>
+            </w:pPr>
+            <w:r>
+              <w:rPr>
+                <w:sz w:val="19"/>
+              </w:rPr>
+            </w:r>
+            <w:r>
+              <w:rPr>
+                <w:sz w:val="19"/>
+              </w:rPr>
+              <w:t>Renewal</w:t>
+            </w:r>
+          </w:p>
+        </w:tc>
+        <w:tc>
+          <w:tcPr>
+            <w:tcW w:type="dxa" w:w="7654"/>
+          </w:tcPr>
+          <w:p>
+            <w:pPr>
+              <w:spacing w:after="20"/>
+            </w:pPr>
+            <w:r>
+              <w:rPr>
+                <w:sz w:val="19"/>
+              </w:rPr>
+            </w:r>
+            <w:r>
+              <w:rPr>
+                <w:sz w:val="19"/>
+              </w:rPr>
+              <w:t xml:space="preserve">Automatic: the Windows scheduled task </w:t>
+            </w:r>
+            <w:r>
+              <w:rPr>
+                <w:b/>
+                <w:sz w:val="19"/>
+              </w:rPr>
+              <w:t>win-acme renew</w:t>
+            </w:r>
+            <w:r>
+              <w:rPr>
+                <w:sz w:val="19"/>
+              </w:rPr>
+              <w:t xml:space="preserve"> runs daily and renews about 30 days before expiry, then updates IIS by itself. Nothing to do by hand.</w:t>
+            </w:r>
+          </w:p>
+        </w:tc>
+      </w:tr>
+      <w:tr>
+        <w:tc>
+          <w:tcPr>
+            <w:tcW w:type="dxa" w:w="1984"/>
+          </w:tcPr>
+          <w:p>
+            <w:pPr>
+              <w:spacing w:after="20"/>
+            </w:pPr>
+            <w:r>
+              <w:rPr>
+                <w:sz w:val="19"/>
+              </w:rPr>
+            </w:r>
+            <w:r>
+              <w:rPr>
+                <w:sz w:val="19"/>
+              </w:rPr>
+              <w:t>Requirement</w:t>
+            </w:r>
+          </w:p>
+        </w:tc>
+        <w:tc>
+          <w:tcPr>
+            <w:tcW w:type="dxa" w:w="7654"/>
+          </w:tcPr>
+          <w:p>
+            <w:pPr>
+              <w:spacing w:after="20"/>
+            </w:pPr>
+            <w:r>
+              <w:rPr>
+                <w:sz w:val="19"/>
+              </w:rPr>
+            </w:r>
+            <w:r>
+              <w:rPr>
+                <w:sz w:val="19"/>
+              </w:rPr>
+              <w:t>Port 80 must stay open to the internet (Azure inbound rule): every renewal is checked over http. The website keeps that check path out of the https redirect.</w:t>
+            </w:r>
+          </w:p>
+        </w:tc>
+      </w:tr>
+      <w:tr>
+        <w:tc>
+          <w:tcPr>
+            <w:tcW w:type="dxa" w:w="1984"/>
+          </w:tcPr>
+          <w:p>
+            <w:pPr>
+              <w:spacing w:after="20"/>
+            </w:pPr>
+            <w:r>
+              <w:rPr>
+                <w:sz w:val="19"/>
+              </w:rPr>
+            </w:r>
+            <w:r>
+              <w:rPr>
+                <w:sz w:val="19"/>
+              </w:rPr>
+              <w:t>Expiry e-mails</w:t>
+            </w:r>
+          </w:p>
+        </w:tc>
+        <w:tc>
+          <w:tcPr>
+            <w:tcW w:type="dxa" w:w="7654"/>
+          </w:tcPr>
+          <w:p>
+            <w:pPr>
+              <w:spacing w:after="20"/>
+            </w:pPr>
+            <w:r>
+              <w:rPr>
+                <w:sz w:val="19"/>
+              </w:rPr>
+            </w:r>
+            <w:r>
+              <w:rPr>
+                <w:sz w:val="19"/>
+              </w:rPr>
+              <w:t xml:space="preserve">Let's Encrypt no longer sends them (since 2025). Check now and then with </w:t>
+            </w:r>
+            <w:r>
+              <w:rPr>
+                <w:rFonts w:ascii="Consolas" w:hAnsi="Consolas" w:eastAsia="Consolas"/>
+                <w:sz w:val="19"/>
+              </w:rPr>
+              <w:t>.\Enable-ZedHttps.ps1 -Status</w:t>
+            </w:r>
+            <w:r>
+              <w:rPr>
+                <w:sz w:val="19"/>
+              </w:rPr>
+              <w:t xml:space="preserve"> (Part D).</w:t>
+            </w:r>
+          </w:p>
+        </w:tc>
+      </w:tr>
+    </w:tbl>
+    <w:p>
+      <w:pPr>
+        <w:spacing w:after="40"/>
+      </w:pPr>
     </w:p>
     <w:p>
       <w:pPr>
@@ -4740,7 +5097,7 @@
               <w:rPr>
                 <w:sz w:val="19"/>
               </w:rPr>
-              <w:t>Certificate renewal</w:t>
+              <w:t>SSL certificate status (monthly)</w:t>
             </w:r>
           </w:p>
         </w:tc>
@@ -4761,7 +5118,77 @@
               <w:rPr>
                 <w:sz w:val="19"/>
               </w:rPr>
-              <w:t xml:space="preserve">Automatic (Task Scheduler &gt; win-acme renew). Manual: </w:t>
+              <w:t xml:space="preserve">From any release </w:t>
+            </w:r>
+            <w:r>
+              <w:rPr>
+                <w:rFonts w:ascii="Consolas" w:hAnsi="Consolas" w:eastAsia="Consolas"/>
+                <w:sz w:val="19"/>
+              </w:rPr>
+              <w:t>scripts</w:t>
+            </w:r>
+            <w:r>
+              <w:rPr>
+                <w:sz w:val="19"/>
+              </w:rPr>
+              <w:t xml:space="preserve"> folder: </w:t>
+            </w:r>
+            <w:r>
+              <w:rPr>
+                <w:rFonts w:ascii="Consolas" w:hAnsi="Consolas" w:eastAsia="Consolas"/>
+                <w:sz w:val="19"/>
+              </w:rPr>
+              <w:t>.\Enable-ZedHttps.ps1 -Status</w:t>
+            </w:r>
+            <w:r>
+              <w:rPr>
+                <w:sz w:val="19"/>
+              </w:rPr>
+              <w:t xml:space="preserve"> - shows the expiry date, days left and the renewal task (and recreates the task if missing).</w:t>
+            </w:r>
+          </w:p>
+        </w:tc>
+      </w:tr>
+      <w:tr>
+        <w:tc>
+          <w:tcPr>
+            <w:tcW w:type="dxa" w:w="2551"/>
+          </w:tcPr>
+          <w:p>
+            <w:pPr>
+              <w:spacing w:after="20"/>
+            </w:pPr>
+            <w:r>
+              <w:rPr>
+                <w:sz w:val="19"/>
+              </w:rPr>
+            </w:r>
+            <w:r>
+              <w:rPr>
+                <w:sz w:val="19"/>
+              </w:rPr>
+              <w:t>SSL certificate renewal</w:t>
+            </w:r>
+          </w:p>
+        </w:tc>
+        <w:tc>
+          <w:tcPr>
+            <w:tcW w:type="dxa" w:w="7087"/>
+          </w:tcPr>
+          <w:p>
+            <w:pPr>
+              <w:spacing w:after="20"/>
+            </w:pPr>
+            <w:r>
+              <w:rPr>
+                <w:sz w:val="19"/>
+              </w:rPr>
+            </w:r>
+            <w:r>
+              <w:rPr>
+                <w:sz w:val="19"/>
+              </w:rPr>
+              <w:t xml:space="preserve">Automatic (Task Scheduler &gt; win-acme renew). Renew now by hand: </w:t>
             </w:r>
             <w:r>
               <w:rPr>
@@ -5696,7 +6123,7 @@
               <w:rPr>
                 <w:sz w:val="19"/>
               </w:rPr>
-              <w:t>Let's Encrypt fails</w:t>
+              <w:t>Free SSL certificate cannot be issued or renewed</w:t>
             </w:r>
           </w:p>
         </w:tc>
@@ -5717,7 +6144,7 @@
               <w:rPr>
                 <w:sz w:val="19"/>
               </w:rPr>
-              <w:t>Port 80 not reachable from the internet.</w:t>
+              <w:t>Port 80 not reachable from the internet, or DNS changed.</w:t>
             </w:r>
           </w:p>
         </w:tc>
@@ -5738,7 +6165,118 @@
               <w:rPr>
                 <w:sz w:val="19"/>
               </w:rPr>
-              <w:t>Azure NSG inbound rule for TCP 80; Windows Firewall rule "ZED website".</w:t>
+              <w:t xml:space="preserve">Azure NSG inbound rule for TCP 80; Windows Firewall rule "ZED website"; </w:t>
+            </w:r>
+            <w:r>
+              <w:rPr>
+                <w:rFonts w:ascii="Consolas" w:hAnsi="Consolas" w:eastAsia="Consolas"/>
+                <w:sz w:val="19"/>
+              </w:rPr>
+              <w:t>nslookup zedcms.umon.in</w:t>
+            </w:r>
+            <w:r>
+              <w:rPr>
+                <w:sz w:val="19"/>
+              </w:rPr>
+              <w:t xml:space="preserve">. Then </w:t>
+            </w:r>
+            <w:r>
+              <w:rPr>
+                <w:rFonts w:ascii="Consolas" w:hAnsi="Consolas" w:eastAsia="Consolas"/>
+                <w:sz w:val="19"/>
+              </w:rPr>
+              <w:t>C:\win-acme\wacs.exe --renew</w:t>
+            </w:r>
+            <w:r>
+              <w:rPr>
+                <w:sz w:val="19"/>
+              </w:rPr>
+              <w:t>.</w:t>
+            </w:r>
+          </w:p>
+        </w:tc>
+      </w:tr>
+      <w:tr>
+        <w:tc>
+          <w:tcPr>
+            <w:tcW w:type="dxa" w:w="2608"/>
+          </w:tcPr>
+          <w:p>
+            <w:pPr>
+              <w:spacing w:after="20"/>
+            </w:pPr>
+            <w:r>
+              <w:rPr>
+                <w:sz w:val="19"/>
+              </w:rPr>
+            </w:r>
+            <w:r>
+              <w:rPr>
+                <w:sz w:val="19"/>
+              </w:rPr>
+              <w:t>Browser warns the certificate expired</w:t>
+            </w:r>
+          </w:p>
+        </w:tc>
+        <w:tc>
+          <w:tcPr>
+            <w:tcW w:type="dxa" w:w="2608"/>
+          </w:tcPr>
+          <w:p>
+            <w:pPr>
+              <w:spacing w:after="20"/>
+            </w:pPr>
+            <w:r>
+              <w:rPr>
+                <w:sz w:val="19"/>
+              </w:rPr>
+            </w:r>
+            <w:r>
+              <w:rPr>
+                <w:sz w:val="19"/>
+              </w:rPr>
+              <w:t>Automatic renewal stopped.</w:t>
+            </w:r>
+          </w:p>
+        </w:tc>
+        <w:tc>
+          <w:tcPr>
+            <w:tcW w:type="dxa" w:w="4422"/>
+          </w:tcPr>
+          <w:p>
+            <w:pPr>
+              <w:spacing w:after="20"/>
+            </w:pPr>
+            <w:r>
+              <w:rPr>
+                <w:sz w:val="19"/>
+              </w:rPr>
+            </w:r>
+            <w:r>
+              <w:rPr>
+                <w:rFonts w:ascii="Consolas" w:hAnsi="Consolas" w:eastAsia="Consolas"/>
+                <w:sz w:val="19"/>
+              </w:rPr>
+              <w:t>.\Enable-ZedHttps.ps1 -Status</w:t>
+            </w:r>
+            <w:r>
+              <w:rPr>
+                <w:sz w:val="19"/>
+              </w:rPr>
+              <w:t xml:space="preserve">; fix as above; </w:t>
+            </w:r>
+            <w:r>
+              <w:rPr>
+                <w:rFonts w:ascii="Consolas" w:hAnsi="Consolas" w:eastAsia="Consolas"/>
+                <w:sz w:val="19"/>
+              </w:rPr>
+              <w:t>C:\win-acme\wacs.exe --renew --force</w:t>
+            </w:r>
+            <w:r>
+              <w:rPr>
+                <w:sz w:val="19"/>
+              </w:rPr>
+              <w:t>.</w:t>
             </w:r>
           </w:p>
         </w:tc>
@@ -6420,6 +6958,19 @@
                 <w:rFonts w:ascii="Consolas" w:hAnsi="Consolas" w:eastAsia="Consolas"/>
                 <w:sz w:val="19"/>
               </w:rPr>
+              <w:t>-HttpsEmail</w:t>
+            </w:r>
+            <w:r>
+              <w:rPr>
+                <w:sz w:val="19"/>
+              </w:rPr>
+              <w:t xml:space="preserve">, </w:t>
+            </w:r>
+            <w:r>
+              <w:rPr>
+                <w:rFonts w:ascii="Consolas" w:hAnsi="Consolas" w:eastAsia="Consolas"/>
+                <w:sz w:val="19"/>
+              </w:rPr>
               <w:t>-Rollback</w:t>
             </w:r>
             <w:r>
@@ -6501,6 +7052,19 @@
                 <w:sz w:val="19"/>
               </w:rPr>
               <w:t>-Email</w:t>
+            </w:r>
+            <w:r>
+              <w:rPr>
+                <w:sz w:val="19"/>
+              </w:rPr>
+              <w:t xml:space="preserve">, </w:t>
+            </w:r>
+            <w:r>
+              <w:rPr>
+                <w:rFonts w:ascii="Consolas" w:hAnsi="Consolas" w:eastAsia="Consolas"/>
+                <w:sz w:val="19"/>
+              </w:rPr>
+              <w:t>-Status</w:t>
             </w:r>
             <w:r>
               <w:rPr>

</xml_diff>